<commit_message>
El material de la CSO siembra 80 señales, más de las 73 que pide un piso del 95 % sin fallas: a la siembra se suma un lote por entidad con las señales que se repiten, cada una en su oportunidad, su cotización o su contrato, sin mover el pronóstico, la meta ni las comisiones; el motor levanta las 80 y ninguna de más
</commit_message>
<xml_diff>
--- a/tests/criterio-cso/material/manufactura-mx/comercial/MBA120315KT4-manufacturas-del-bajio/20-comite/acta-comite-2026-10-02.docx
+++ b/tests/criterio-cso/material/manufactura-mx/comercial/MBA120315KT4-manufacturas-del-bajio/20-comite/acta-comite-2026-10-02.docx
@@ -36,12 +36,12 @@
     </w:p>
     <w:p>
       <w:r>
-        <w:t xml:space="preserve">pronóstico de ventas de $ 3,780,000. El mejor escenario, si cierran</w:t>
+        <w:t xml:space="preserve">pronóstico de ventas de $ 4,662,000. El mejor escenario, si cierran</w:t>
       </w:r>
     </w:p>
     <w:p>
       <w:r>
-        <w:t xml:space="preserve">todas las negociaciones abiertas, es de $ 5,760,000; no se compromete.</w:t>
+        <w:t xml:space="preserve">todas las negociaciones abiertas, es de $ 7,104,000; no se compromete.</w:t>
       </w:r>
     </w:p>
     <w:p>

</xml_diff>